<commit_message>
Update smart city project title
</commit_message>
<xml_diff>
--- a/derieux-resume.docx
+++ b/derieux-resume.docx
@@ -913,10 +913,7 @@
               <w:t xml:space="preserve">ndustry professional </w:t>
             </w:r>
             <w:r>
-              <w:t>with research exper</w:t>
-            </w:r>
-            <w:r>
-              <w:t xml:space="preserve">ience in </w:t>
+              <w:t xml:space="preserve">with research experience in </w:t>
             </w:r>
             <w:r>
               <w:t xml:space="preserve">quantum computing, machine learning, </w:t>
@@ -5691,7 +5688,7 @@
                     <w:keepNext w:val="0"/>
                   </w:pPr>
                   <w:r>
-                    <w:t>Smart Garden Alleys</w:t>
+                    <w:t>Transformer Networks for Smart Cities: Framework and Application to Makassar Smart Garden Alleys</w:t>
                   </w:r>
                 </w:p>
               </w:tc>
@@ -10255,6 +10252,7 @@
     <w:rsid w:val="00674A94"/>
     <w:rsid w:val="006B5A05"/>
     <w:rsid w:val="006D4195"/>
+    <w:rsid w:val="00717757"/>
     <w:rsid w:val="00741838"/>
     <w:rsid w:val="0075251F"/>
     <w:rsid w:val="007A77FF"/>
@@ -10269,6 +10267,7 @@
     <w:rsid w:val="00B3182F"/>
     <w:rsid w:val="00B67F5F"/>
     <w:rsid w:val="00B85965"/>
+    <w:rsid w:val="00B945CD"/>
     <w:rsid w:val="00BA4BB8"/>
     <w:rsid w:val="00BE09F0"/>
     <w:rsid w:val="00BF3AAB"/>

</xml_diff>